<commit_message>
Update two_axis_framework.docx to incorporate recent enhancements in the collaborative plugin framework, focusing on improved clarity regarding multi-team roles and responsibilities. This revision aims to further refine the governance model and task coordination within AgentAlign.
</commit_message>
<xml_diff>
--- a/docs/paper/two_axis_framework.docx
+++ b/docs/paper/two_axis_framework.docx
@@ -1060,7 +1060,7 @@
           <w:szCs w:val="22"/>
           <w:rtl w:val="0"/>
         </w:rPr>
-        <w:t xml:space="preserve"> sit in the bottom half. The goal is the top right, but the path requires independent investment in both axes — moving only along one leaves value on the table.</w:t>
+        <w:t xml:space="preserve"> currently sit in the bottom half — the “Starting Point.” The goal is the top-right quadrant, the Converged Frontier, but reaching it requires deliberate and independent investment in both axes. Advancing along only one dimension leaves significant value on the table.</w:t>
       </w:r>
       <w:r>
         <w:rPr>
@@ -1340,7 +1340,24 @@
           <w:szCs w:val="22"/>
           <w:rtl w:val="0"/>
         </w:rPr>
-        <w:t xml:space="preserve"> a scale for how rigorously this loop is governed. EP 1 and 2 are </w:t>
+        <w:t xml:space="preserve"> a scale for </w:t>
+      </w:r>
+      <w:r>
+        <w:rPr>
+          <w:color w:val="4a4a6a"/>
+          <w:rtl w:val="0"/>
+        </w:rPr>
+        <w:t xml:space="preserve">the degree of rigor with which</w:t>
+      </w:r>
+      <w:r>
+        <w:rPr>
+          <w:rFonts w:ascii="Georgia" w:cs="Georgia" w:eastAsia="Georgia" w:hAnsi="Georgia"/>
+          <w:color w:val="4a4a6a"/>
+          <w:sz w:val="22"/>
+          <w:szCs w:val="22"/>
+          <w:rtl w:val="0"/>
+        </w:rPr>
+        <w:t xml:space="preserve"> this loop is governed. EP 1 and 2 are </w:t>
       </w:r>
       <w:r>
         <w:rPr>
@@ -1458,7 +1475,24 @@
           <w:szCs w:val="22"/>
           <w:rtl w:val="0"/>
         </w:rPr>
-        <w:t xml:space="preserve">are working with layers 1 and 2 informally. EP 4 means you have </w:t>
+        <w:t xml:space="preserve">are working </w:t>
+      </w:r>
+      <w:r>
+        <w:rPr>
+          <w:color w:val="4a4a6a"/>
+          <w:rtl w:val="0"/>
+        </w:rPr>
+        <w:t xml:space="preserve">informally with layers 1 and 2</w:t>
+      </w:r>
+      <w:r>
+        <w:rPr>
+          <w:rFonts w:ascii="Georgia" w:cs="Georgia" w:eastAsia="Georgia" w:hAnsi="Georgia"/>
+          <w:color w:val="4a4a6a"/>
+          <w:sz w:val="22"/>
+          <w:szCs w:val="22"/>
+          <w:rtl w:val="0"/>
+        </w:rPr>
+        <w:t xml:space="preserve">. EP 4 means you have </w:t>
       </w:r>
       <w:r>
         <w:rPr>
@@ -2573,7 +2607,24 @@
           <w:szCs w:val="22"/>
           <w:rtl w:val="0"/>
         </w:rPr>
-        <w:t xml:space="preserve">The test that separates Level 5 from a talented Level 4 individual is simple: could someone else walk in tomorrow and run at Level 4 quality from day one, using only what is written down? If the answer is no — if the institutional knowledge lives in someone’s head rather than in machine-readable artefacts — then the </w:t>
+        <w:t xml:space="preserve">The test that separates Level 5 from a talented Level 4 individual is simple: could someone else walk in tomorrow and run at Level 4 quality from day one, using only what is written down? If the answer is no — if the institutional knowledge lives in someone’s head rather than in machine-readable </w:t>
+      </w:r>
+      <w:r>
+        <w:rPr>
+          <w:color w:val="4a4a6a"/>
+          <w:rtl w:val="0"/>
+        </w:rPr>
+        <w:t xml:space="preserve">artifacts</w:t>
+      </w:r>
+      <w:r>
+        <w:rPr>
+          <w:rFonts w:ascii="Georgia" w:cs="Georgia" w:eastAsia="Georgia" w:hAnsi="Georgia"/>
+          <w:color w:val="4a4a6a"/>
+          <w:sz w:val="22"/>
+          <w:szCs w:val="22"/>
+          <w:rtl w:val="0"/>
+        </w:rPr>
+        <w:t xml:space="preserve"> — then the </w:t>
       </w:r>
       <w:r>
         <w:rPr>
@@ -4251,6 +4302,273 @@
         <w:rPr>
           <w:rtl w:val="0"/>
         </w:rPr>
+      </w:r>
+    </w:p>
+    <w:p>
+      <w:pPr>
+        <w:spacing w:after="160" w:before="0" w:line="276" w:lineRule="auto"/>
+        <w:jc w:val="both"/>
+        <w:rPr>
+          <w:rFonts w:ascii="Georgia" w:cs="Georgia" w:eastAsia="Georgia" w:hAnsi="Georgia"/>
+          <w:color w:val="4a4a6a"/>
+          <w:sz w:val="22"/>
+          <w:szCs w:val="22"/>
+        </w:rPr>
+      </w:pPr>
+      <w:r>
+        <w:rPr>
+          <w:rFonts w:ascii="Georgia" w:cs="Georgia" w:eastAsia="Georgia" w:hAnsi="Georgia"/>
+          <w:color w:val="4a4a6a"/>
+          <w:sz w:val="22"/>
+          <w:szCs w:val="22"/>
+          <w:rtl w:val="0"/>
+        </w:rPr>
+        <w:t xml:space="preserve">Beyond these four properties, real-world production experience across multiple agent harnesses reveals a critical fifth requirement: context continuity. Without deliberate management of the agent’s working set, even a well-designed AIN Level 4 feedback loop degrades under sustained load — not catastrophically, but gradually and expensively.</w:t>
+      </w:r>
+    </w:p>
+    <w:p>
+      <w:pPr>
+        <w:pStyle w:val="Heading2"/>
+        <w:rPr/>
+      </w:pPr>
+      <w:r>
+        <w:rPr>
+          <w:rFonts w:ascii="Arial" w:cs="Arial" w:eastAsia="Arial" w:hAnsi="Arial"/>
+          <w:b w:val="1"/>
+          <w:bCs w:val="1"/>
+          <w:color w:val="1a7a7a"/>
+          <w:sz w:val="26"/>
+          <w:szCs w:val="26"/>
+          <w:rtl w:val="0"/>
+        </w:rPr>
+        <w:t xml:space="preserve">Context Continuity — The Fifth Production Requirement</w:t>
+      </w:r>
+      <w:r>
+        <w:rPr>
+          <w:rtl w:val="0"/>
+        </w:rPr>
+      </w:r>
+    </w:p>
+    <w:p>
+      <w:pPr>
+        <w:spacing w:after="160" w:before="0" w:line="276" w:lineRule="auto"/>
+        <w:jc w:val="both"/>
+        <w:rPr>
+          <w:rFonts w:ascii="Georgia" w:cs="Georgia" w:eastAsia="Georgia" w:hAnsi="Georgia"/>
+          <w:color w:val="4a4a6a"/>
+          <w:sz w:val="22"/>
+          <w:szCs w:val="22"/>
+        </w:rPr>
+      </w:pPr>
+      <w:r>
+        <w:rPr>
+          <w:color w:val="4a4a6a"/>
+          <w:rtl w:val="0"/>
+        </w:rPr>
+        <w:t xml:space="preserve">A comparative analysis of production agent harnesses — including Claude Code, Pi, OpenClaw, and Letta — reveals a fifth operational requirement that R.E.S.T.</w:t>
+      </w:r>
+      <w:r>
+        <w:rPr>
+          <w:rFonts w:ascii="Georgia" w:cs="Georgia" w:eastAsia="Georgia" w:hAnsi="Georgia"/>
+          <w:color w:val="4a4a6a"/>
+          <w:sz w:val="22"/>
+          <w:szCs w:val="22"/>
+          <w:rtl w:val="0"/>
+        </w:rPr>
+        <w:t xml:space="preserve"> does not cover: context continuity. Every one of these systems independently converged on the same finding: an AIN Level 4 feedback loop that works at demo scale will degrade under production load if the agent runtime does not actively manage its own working set. As sessions grow, file reads expand, tool outputs accumulate, and sub-agent calls multiply. Without active management, the agent loses coherence — not catastrophically, but gradually, in ways that are hard to detect and expensive to diagnose.</w:t>
+      </w:r>
+    </w:p>
+    <w:p>
+      <w:pPr>
+        <w:spacing w:after="160" w:before="0" w:line="276" w:lineRule="auto"/>
+        <w:jc w:val="both"/>
+        <w:rPr>
+          <w:rFonts w:ascii="Georgia" w:cs="Georgia" w:eastAsia="Georgia" w:hAnsi="Georgia"/>
+          <w:color w:val="4a4a6a"/>
+          <w:sz w:val="22"/>
+          <w:szCs w:val="22"/>
+        </w:rPr>
+      </w:pPr>
+      <w:r>
+        <w:rPr>
+          <w:rFonts w:ascii="Georgia" w:cs="Georgia" w:eastAsia="Georgia" w:hAnsi="Georgia"/>
+          <w:color w:val="4a4a6a"/>
+          <w:sz w:val="22"/>
+          <w:szCs w:val="22"/>
+          <w:rtl w:val="0"/>
+        </w:rPr>
+        <w:t xml:space="preserve">The convergent solutions across all four harnesses point to four specific requirements for context continuity in a production AIN Level 4 system. File reads must be capped and paginated — hard limits on read size with explicit continuation mechanisms, not unbounded reads that flood the context window with boilerplate. Oversized tool results must be offloaded outside the context window, replaced with compressed previews the agent can expand on demand; a 60KB grep result that consumes a third of the context budget on the first turn of a session makes every subsequent turn worse. Session compaction must be triggered by token pressure and must respect tool-call boundary integrity — compaction that orphans a tool call from its result corrupts the agent’s understanding of what has already happened. Sub-agent sessions must be isolated from parent transcripts unless forking is deliberate, preventing cascading context pollution across agent boundaries.</w:t>
+      </w:r>
+    </w:p>
+    <w:p>
+      <w:pPr>
+        <w:spacing w:after="160" w:before="0" w:line="276" w:lineRule="auto"/>
+        <w:jc w:val="both"/>
+        <w:rPr>
+          <w:rFonts w:ascii="Georgia" w:cs="Georgia" w:eastAsia="Georgia" w:hAnsi="Georgia"/>
+          <w:color w:val="4a4a6a"/>
+          <w:sz w:val="22"/>
+          <w:szCs w:val="22"/>
+        </w:rPr>
+      </w:pPr>
+      <w:r>
+        <w:rPr>
+          <w:rFonts w:ascii="Georgia" w:cs="Georgia" w:eastAsia="Georgia" w:hAnsi="Georgia"/>
+          <w:color w:val="4a4a6a"/>
+          <w:sz w:val="22"/>
+          <w:szCs w:val="22"/>
+          <w:rtl w:val="0"/>
+        </w:rPr>
+        <w:t xml:space="preserve">There is also a deduplication principle worth naming explicitly: known observations should not consume context budget </w:t>
+      </w:r>
+      <w:r>
+        <w:rPr>
+          <w:color w:val="4a4a6a"/>
+          <w:rtl w:val="0"/>
+        </w:rPr>
+        <w:t xml:space="preserve">as much as</w:t>
+      </w:r>
+      <w:r>
+        <w:rPr>
+          <w:rFonts w:ascii="Georgia" w:cs="Georgia" w:eastAsia="Georgia" w:hAnsi="Georgia"/>
+          <w:color w:val="4a4a6a"/>
+          <w:sz w:val="22"/>
+          <w:szCs w:val="22"/>
+          <w:rtl w:val="0"/>
+        </w:rPr>
+        <w:t xml:space="preserve"> new ones do. Claude Code implements this as read deduplication — if the agent re-reads the same file at the same range and the file has not changed, a stub is returned rather than the full content. AgentAlign’s rule system applies the same logic at the governance layer: drift-detector checks rules before creating ADRs, so known failure patterns do not regenerate governance overhead. The underlying principle is identical — compounding systems must not re-process what they already know.</w:t>
+      </w:r>
+    </w:p>
+    <w:p>
+      <w:pPr>
+        <w:spacing w:after="160" w:before="0" w:line="276" w:lineRule="auto"/>
+        <w:jc w:val="both"/>
+        <w:rPr>
+          <w:rFonts w:ascii="Georgia" w:cs="Georgia" w:eastAsia="Georgia" w:hAnsi="Georgia"/>
+          <w:color w:val="4a4a6a"/>
+          <w:sz w:val="22"/>
+          <w:szCs w:val="22"/>
+        </w:rPr>
+      </w:pPr>
+      <w:r>
+        <w:rPr>
+          <w:rFonts w:ascii="Georgia" w:cs="Georgia" w:eastAsia="Georgia" w:hAnsi="Georgia"/>
+          <w:color w:val="4a4a6a"/>
+          <w:sz w:val="22"/>
+          <w:szCs w:val="22"/>
+          <w:rtl w:val="0"/>
+        </w:rPr>
+        <w:t xml:space="preserve">What makes this finding compelling is not the mechanisms themselves but how they were discovered. These four engineering teams did not coordinate. They faced the same physical constraint — a finite context window under production load — and independently arrived at the same five solutions. This is convergent evolution in engineering: the same way fluid dynamics produces fins on both sharks and dolphins, token pressure produces identical mechanisms in every harness that takes production seriously. It is not a prescribed best-practices checklist. It is what happens when you build at scale.</w:t>
+      </w:r>
+    </w:p>
+    <w:p>
+      <w:pPr>
+        <w:spacing w:after="160" w:before="0" w:line="276" w:lineRule="auto"/>
+        <w:jc w:val="both"/>
+        <w:rPr>
+          <w:rFonts w:ascii="Georgia" w:cs="Georgia" w:eastAsia="Georgia" w:hAnsi="Georgia"/>
+          <w:color w:val="4a4a6a"/>
+          <w:sz w:val="22"/>
+          <w:szCs w:val="22"/>
+        </w:rPr>
+      </w:pPr>
+      <w:r>
+        <w:rPr>
+          <w:rFonts w:ascii="Georgia" w:cs="Georgia" w:eastAsia="Georgia" w:hAnsi="Georgia"/>
+          <w:color w:val="4a4a6a"/>
+          <w:sz w:val="22"/>
+          <w:szCs w:val="22"/>
+          <w:rtl w:val="0"/>
+        </w:rPr>
+        <w:t xml:space="preserve">The most important architectural nuance the convergence analysis surfaces is not that tool results get offloaded — it is when. Claude Code does not wait for context pressure. Before every API call, oversized tool results are written to disk and replaced with a 2KB preview in context. A 60KB grep result gets kicked out on the very first turn, before anything is close to full. Experience teaches that tool output is the primary killer of the context window, so the harness acts first. The implication for AIN Level 4 design: tool result offloading should not be a pressure-relief valve. It should be the default path, with in-context retention as the exception. Tool output is presumptively disposable — useful for the current reasoning step, archivable thereafter.</w:t>
+      </w:r>
+    </w:p>
+    <w:p>
+      <w:pPr>
+        <w:spacing w:after="160" w:before="0" w:line="276" w:lineRule="auto"/>
+        <w:jc w:val="both"/>
+        <w:rPr>
+          <w:rFonts w:ascii="Georgia" w:cs="Georgia" w:eastAsia="Georgia" w:hAnsi="Georgia"/>
+          <w:color w:val="4a4a6a"/>
+          <w:sz w:val="22"/>
+          <w:szCs w:val="22"/>
+        </w:rPr>
+      </w:pPr>
+      <w:r>
+        <w:rPr>
+          <w:rFonts w:ascii="Georgia" w:cs="Georgia" w:eastAsia="Georgia" w:hAnsi="Georgia"/>
+          <w:color w:val="4a4a6a"/>
+          <w:sz w:val="22"/>
+          <w:szCs w:val="22"/>
+          <w:rtl w:val="0"/>
+        </w:rPr>
+        <w:t xml:space="preserve">Sub-agent session isolation follows the same logic. All four harnesses default to not passing parent session context to child agents — not because engineers forgot to wire up inheritance, but because parent session noise overwhelms child task objectives. Context is not inherited. Context must be designed. The deliberate absence of inheritance is itself a governance decision, as consequential as any rule in the </w:t>
+      </w:r>
+      <w:r>
+        <w:rPr>
+          <w:color w:val="4a4a6a"/>
+          <w:rtl w:val="0"/>
+        </w:rPr>
+        <w:t xml:space="preserve">ruleset</w:t>
+      </w:r>
+      <w:r>
+        <w:rPr>
+          <w:rFonts w:ascii="Georgia" w:cs="Georgia" w:eastAsia="Georgia" w:hAnsi="Georgia"/>
+          <w:color w:val="4a4a6a"/>
+          <w:sz w:val="22"/>
+          <w:szCs w:val="22"/>
+          <w:rtl w:val="0"/>
+        </w:rPr>
+        <w:t xml:space="preserve">. A child agent that receives only its task string and the current rule set will outperform one that inherits a sprawling parent transcript every time.</w:t>
+      </w:r>
+    </w:p>
+    <w:p>
+      <w:pPr>
+        <w:spacing w:after="160" w:before="0" w:line="276" w:lineRule="auto"/>
+        <w:jc w:val="both"/>
+        <w:rPr>
+          <w:rFonts w:ascii="Georgia" w:cs="Georgia" w:eastAsia="Georgia" w:hAnsi="Georgia"/>
+          <w:i w:val="1"/>
+          <w:iCs w:val="1"/>
+          <w:color w:val="1a7a7a"/>
+          <w:sz w:val="21"/>
+          <w:szCs w:val="21"/>
+        </w:rPr>
+      </w:pPr>
+      <w:r>
+        <w:rPr>
+          <w:rFonts w:ascii="Georgia" w:cs="Georgia" w:eastAsia="Georgia" w:hAnsi="Georgia"/>
+          <w:i w:val="1"/>
+          <w:iCs w:val="1"/>
+          <w:color w:val="1a7a7a"/>
+          <w:sz w:val="21"/>
+          <w:szCs w:val="21"/>
+          <w:rtl w:val="0"/>
+        </w:rPr>
+        <w:t xml:space="preserve">Context continuity is not a feature to add later. A product that achieves AIN Level 4 composability and feedback in short sessions but degrades after 30 minutes of production operation has not achieved AIN Level 4. It has achieved a demo. Fifty years of computing taught us that the best memory management is the kind </w:t>
+      </w:r>
+      <w:r>
+        <w:rPr>
+          <w:i w:val="1"/>
+          <w:iCs w:val="1"/>
+          <w:color w:val="1a7a7a"/>
+          <w:sz w:val="21"/>
+          <w:szCs w:val="21"/>
+          <w:rtl w:val="0"/>
+        </w:rPr>
+        <w:t xml:space="preserve">that </w:t>
+      </w:r>
+      <w:r>
+        <w:rPr>
+          <w:rFonts w:ascii="Georgia" w:cs="Georgia" w:eastAsia="Georgia" w:hAnsi="Georgia"/>
+          <w:i w:val="1"/>
+          <w:iCs w:val="1"/>
+          <w:color w:val="1a7a7a"/>
+          <w:sz w:val="21"/>
+          <w:szCs w:val="21"/>
+          <w:rtl w:val="0"/>
+        </w:rPr>
+        <w:t xml:space="preserve">the running program never has to think about. The same principle applies here: the goal is not to show the agent everything — it is to give it the right working set at the right time, managed by the harness, invisible to the agent’s reasoning layer.</w:t>
       </w:r>
     </w:p>
     <w:p>
@@ -10902,6 +11220,32 @@
     </w:p>
     <w:p>
       <w:pPr>
+        <w:numPr>
+          <w:ilvl w:val="0"/>
+          <w:numId w:val="1"/>
+        </w:numPr>
+        <w:spacing w:after="40" w:before="40" w:line="276" w:lineRule="auto"/>
+        <w:ind w:left="560" w:hanging="280"/>
+        <w:rPr>
+          <w:rFonts w:ascii="Georgia" w:cs="Georgia" w:eastAsia="Georgia" w:hAnsi="Georgia"/>
+          <w:color w:val="4a4a6a"/>
+          <w:sz w:val="22"/>
+          <w:szCs w:val="22"/>
+        </w:rPr>
+      </w:pPr>
+      <w:r>
+        <w:rPr>
+          <w:rFonts w:ascii="Georgia" w:cs="Georgia" w:eastAsia="Georgia" w:hAnsi="Georgia"/>
+          <w:color w:val="4a4a6a"/>
+          <w:sz w:val="22"/>
+          <w:szCs w:val="22"/>
+          <w:rtl w:val="0"/>
+        </w:rPr>
+        <w:t xml:space="preserve">Does your agent runtime actively manage context — capping file reads, offloading oversized tool results, compacting on token pressure, and isolating sub-agent sessions? A system that achieves AIN 4 in short sessions but degrades after 30 minutes of operation has achieved a demo, not production. (AIN 4 — context continuity)</w:t>
+      </w:r>
+    </w:p>
+    <w:p>
+      <w:pPr>
         <w:spacing w:after="200" w:before="0" w:lineRule="auto"/>
         <w:rPr/>
       </w:pPr>
@@ -13097,6 +13441,32 @@
         <w:rPr>
           <w:rtl w:val="0"/>
         </w:rPr>
+      </w:r>
+    </w:p>
+    <w:p>
+      <w:pPr>
+        <w:numPr>
+          <w:ilvl w:val="0"/>
+          <w:numId w:val="1"/>
+        </w:numPr>
+        <w:spacing w:after="40" w:before="40" w:line="276" w:lineRule="auto"/>
+        <w:ind w:left="560" w:hanging="280"/>
+        <w:rPr>
+          <w:rFonts w:ascii="Georgia" w:cs="Georgia" w:eastAsia="Georgia" w:hAnsi="Georgia"/>
+          <w:color w:val="4a4a6a"/>
+          <w:sz w:val="22"/>
+          <w:szCs w:val="22"/>
+        </w:rPr>
+      </w:pPr>
+      <w:r>
+        <w:rPr>
+          <w:rFonts w:ascii="Georgia" w:cs="Georgia" w:eastAsia="Georgia" w:hAnsi="Georgia"/>
+          <w:color w:val="4a4a6a"/>
+          <w:sz w:val="22"/>
+          <w:szCs w:val="22"/>
+          <w:rtl w:val="0"/>
+        </w:rPr>
+        <w:t xml:space="preserve">Context Management in Agent Harnesses (Arize AI, 2026) — a comparative analysis of how Claude Code, Pi, OpenClaw, and Letta manage file reads, tool result offloading, session compaction, and sub-agent isolation. The convergent patterns across all four systems ground the context continuity requirement described in Section 4 of this paper. Directly relevant to teams designing AIN Level 4 runtime infrastructure. The convergent-evolution framing — that identical mechanisms emerge independently from the same physical constraint — is developed further in practitioner commentary by YuLoop (2026), which also introduces the proactive offloading insight and the formulation “context is not inherited, context must be designed.”</w:t>
       </w:r>
     </w:p>
     <w:p>

</xml_diff>

<commit_message>
Update dependency check script to reflect Arpinine Harness branding and modify document to include recent enhancements in the collaborative plugin framework.
</commit_message>
<xml_diff>
--- a/docs/paper/two_axis_framework.docx
+++ b/docs/paper/two_axis_framework.docx
@@ -132,7 +132,7 @@
           <w:szCs w:val="19"/>
           <w:rtl w:val="0"/>
         </w:rPr>
-        <w:t xml:space="preserve">Includes implementation reference: AgentAlign v1.4.0 by Arpinine</w:t>
+        <w:t xml:space="preserve">Includes implementation reference: Arpinine-Harness v1.4.0 by Arpinine</w:t>
       </w:r>
       <w:r>
         <w:rPr>
@@ -247,7 +247,24 @@
           <w:szCs w:val="22"/>
           <w:rtl w:val="0"/>
         </w:rPr>
-        <w:t xml:space="preserve">This paper deepens a two-axis framework that separates Engineering Process maturity (EP) from Product AI-Nativeness (AIN). These two dimensions are independent, and treating them as one is, in our view, the single most common strategic error in AI engineering today. Throughout, we reference AgentAlign — a Claude Code plugin built by Arpinine — as a live implementation of the governance structures we describe. It is not the only way to put this framework into practice, but it is the most complete working example we have seen.</w:t>
+        <w:t xml:space="preserve">This paper deepens a two-axis framework that separates Engineering Process maturity (EP) from Product AI-Nativeness (AIN). These two dimensions are independent, and treating them as one is, in our view, the single most common strategic error in AI engineering today. Throughout, we reference </w:t>
+      </w:r>
+      <w:r>
+        <w:rPr>
+          <w:color w:val="4a4a6a"/>
+          <w:rtl w:val="0"/>
+        </w:rPr>
+        <w:t xml:space="preserve">Arpinine-Harness</w:t>
+      </w:r>
+      <w:r>
+        <w:rPr>
+          <w:rFonts w:ascii="Georgia" w:cs="Georgia" w:eastAsia="Georgia" w:hAnsi="Georgia"/>
+          <w:color w:val="4a4a6a"/>
+          <w:sz w:val="22"/>
+          <w:szCs w:val="22"/>
+          <w:rtl w:val="0"/>
+        </w:rPr>
+        <w:t xml:space="preserve"> — a Claude Code plugin built by Arpinine — as a live implementation of the governance structures we describe. It is not the only way to put this framework into practice, but it is the most complete working example we have seen.</w:t>
       </w:r>
       <w:r>
         <w:rPr>
@@ -519,7 +536,24 @@
           <w:szCs w:val="22"/>
           <w:rtl w:val="0"/>
         </w:rPr>
-        <w:t xml:space="preserve">A useful frame here comes from Harness Engineering: Agent = Model + Harness. The model is the intelligence. The harness is everything that makes that intelligence safe to ship — the schemas, the policy gates, the sandboxes, the traces, the evals. Crucially, the model is a commodity you buy by the token. The harness is capital you build, own, and accumulate. Two teams running identical models will produce different outcomes because their harnesses differ. This is why governance infrastructure compounds and model upgrades don’t.</w:t>
+        <w:t xml:space="preserve">A useful frame here comes from Harness Engineering: Agent = Model + Harness. The model </w:t>
+      </w:r>
+      <w:r>
+        <w:rPr>
+          <w:color w:val="4a4a6a"/>
+          <w:rtl w:val="0"/>
+        </w:rPr>
+        <w:t xml:space="preserve">is intelligence</w:t>
+      </w:r>
+      <w:r>
+        <w:rPr>
+          <w:rFonts w:ascii="Georgia" w:cs="Georgia" w:eastAsia="Georgia" w:hAnsi="Georgia"/>
+          <w:color w:val="4a4a6a"/>
+          <w:sz w:val="22"/>
+          <w:szCs w:val="22"/>
+          <w:rtl w:val="0"/>
+        </w:rPr>
+        <w:t xml:space="preserve">. The harness is everything that makes that intelligence safe to ship — the schemas, the policy gates, the sandboxes, the traces, the evals. Crucially, the model is a commodity you buy by the token. The harness is capital you build, own, and accumulate. Two teams running identical models will produce different outcomes because their harnesses differ. This is why governance infrastructure compounds and model upgrades don’t.</w:t>
       </w:r>
       <w:r>
         <w:rPr>
@@ -668,7 +702,25 @@
           <w:szCs w:val="22"/>
           <w:rtl w:val="0"/>
         </w:rPr>
-        <w:t xml:space="preserve">EP is about how the human–AI collaboration is actually governed. Not what model you use — that is irrelevant here. The question is: what constrains the AI’s </w:t>
+        <w:t xml:space="preserve">EP is about </w:t>
+      </w:r>
+      <w:r>
+        <w:rPr>
+          <w:color w:val="4a4a6a"/>
+          <w:rtl w:val="0"/>
+        </w:rPr>
+        <w:t xml:space="preserve">how human</w:t>
+        <w:tab/>
+      </w:r>
+      <w:r>
+        <w:rPr>
+          <w:rFonts w:ascii="Georgia" w:cs="Georgia" w:eastAsia="Georgia" w:hAnsi="Georgia"/>
+          <w:color w:val="4a4a6a"/>
+          <w:sz w:val="22"/>
+          <w:szCs w:val="22"/>
+          <w:rtl w:val="0"/>
+        </w:rPr>
+        <w:t xml:space="preserve">–AI collaboration is actually governed. Not what model you use — that is irrelevant here. The question is: what constrains the AI’s </w:t>
       </w:r>
       <w:r>
         <w:rPr>
@@ -1100,7 +1152,7 @@
                     <pic:cNvPicPr preferRelativeResize="0"/>
                   </pic:nvPicPr>
                   <pic:blipFill>
-                    <a:blip r:embed="rId6"/>
+                    <a:blip r:embed="rId7"/>
                     <a:srcRect b="0" l="0" r="0" t="0"/>
                     <a:stretch>
                       <a:fillRect/>
@@ -1340,24 +1392,7 @@
           <w:szCs w:val="22"/>
           <w:rtl w:val="0"/>
         </w:rPr>
-        <w:t xml:space="preserve"> a scale for </w:t>
-      </w:r>
-      <w:r>
-        <w:rPr>
-          <w:color w:val="4a4a6a"/>
-          <w:rtl w:val="0"/>
-        </w:rPr>
-        <w:t xml:space="preserve">the degree of rigor with which</w:t>
-      </w:r>
-      <w:r>
-        <w:rPr>
-          <w:rFonts w:ascii="Georgia" w:cs="Georgia" w:eastAsia="Georgia" w:hAnsi="Georgia"/>
-          <w:color w:val="4a4a6a"/>
-          <w:sz w:val="22"/>
-          <w:szCs w:val="22"/>
-          <w:rtl w:val="0"/>
-        </w:rPr>
-        <w:t xml:space="preserve"> this loop is governed. EP 1 and 2 are </w:t>
+        <w:t xml:space="preserve"> a scale for how rigorously this loop is governed. EP 1 and 2 are </w:t>
       </w:r>
       <w:r>
         <w:rPr>
@@ -1475,24 +1510,7 @@
           <w:szCs w:val="22"/>
           <w:rtl w:val="0"/>
         </w:rPr>
-        <w:t xml:space="preserve">are working </w:t>
-      </w:r>
-      <w:r>
-        <w:rPr>
-          <w:color w:val="4a4a6a"/>
-          <w:rtl w:val="0"/>
-        </w:rPr>
-        <w:t xml:space="preserve">informally with layers 1 and 2</w:t>
-      </w:r>
-      <w:r>
-        <w:rPr>
-          <w:rFonts w:ascii="Georgia" w:cs="Georgia" w:eastAsia="Georgia" w:hAnsi="Georgia"/>
-          <w:color w:val="4a4a6a"/>
-          <w:sz w:val="22"/>
-          <w:szCs w:val="22"/>
-          <w:rtl w:val="0"/>
-        </w:rPr>
-        <w:t xml:space="preserve">. EP 4 means you have </w:t>
+        <w:t xml:space="preserve">are working with layers 1 and 2 informally. EP 4 means you have </w:t>
       </w:r>
       <w:r>
         <w:rPr>
@@ -1929,7 +1947,7 @@
                 <w:szCs w:val="19"/>
                 <w:rtl w:val="0"/>
               </w:rPr>
-              <w:t xml:space="preserve">▸ AgentAlign implementation  </w:t>
+              <w:t xml:space="preserve">▸ Arpinine-Harness implementation  </w:t>
             </w:r>
             <w:r>
               <w:rPr>
@@ -2358,7 +2376,7 @@
                 <w:szCs w:val="19"/>
                 <w:rtl w:val="0"/>
               </w:rPr>
-              <w:t xml:space="preserve">▸ AgentAlign implementation  </w:t>
+              <w:t xml:space="preserve">▸ Arpinine-Harness implementation  </w:t>
             </w:r>
             <w:r>
               <w:rPr>
@@ -2607,24 +2625,7 @@
           <w:szCs w:val="22"/>
           <w:rtl w:val="0"/>
         </w:rPr>
-        <w:t xml:space="preserve">The test that separates Level 5 from a talented Level 4 individual is simple: could someone else walk in tomorrow and run at Level 4 quality from day one, using only what is written down? If the answer is no — if the institutional knowledge lives in someone’s head rather than in machine-readable </w:t>
-      </w:r>
-      <w:r>
-        <w:rPr>
-          <w:color w:val="4a4a6a"/>
-          <w:rtl w:val="0"/>
-        </w:rPr>
-        <w:t xml:space="preserve">artifacts</w:t>
-      </w:r>
-      <w:r>
-        <w:rPr>
-          <w:rFonts w:ascii="Georgia" w:cs="Georgia" w:eastAsia="Georgia" w:hAnsi="Georgia"/>
-          <w:color w:val="4a4a6a"/>
-          <w:sz w:val="22"/>
-          <w:szCs w:val="22"/>
-          <w:rtl w:val="0"/>
-        </w:rPr>
-        <w:t xml:space="preserve"> — then the </w:t>
+        <w:t xml:space="preserve">The test that separates Level 5 from a talented Level 4 individual is simple: could someone else walk in tomorrow and run at Level 4 quality from day one, using only what is written down? If the answer is no — if the institutional knowledge lives in someone’s head rather than in machine-readable artefacts — then the </w:t>
       </w:r>
       <w:r>
         <w:rPr>
@@ -2720,7 +2721,7 @@
                 <w:szCs w:val="19"/>
                 <w:rtl w:val="0"/>
               </w:rPr>
-              <w:t xml:space="preserve">▸ AgentAlign implementation  </w:t>
+              <w:t xml:space="preserve">▸ Arpinine-Harness implementation  </w:t>
             </w:r>
             <w:r>
               <w:rPr>
@@ -3353,7 +3354,7 @@
                 <w:szCs w:val="19"/>
                 <w:rtl w:val="0"/>
               </w:rPr>
-              <w:t xml:space="preserve">▸ AgentAlign implementation  </w:t>
+              <w:t xml:space="preserve">▸ Arpinine-Harness implementation  </w:t>
             </w:r>
             <w:r>
               <w:rPr>
@@ -3619,7 +3620,24 @@
           <w:szCs w:val="22"/>
           <w:rtl w:val="0"/>
         </w:rPr>
-        <w:t xml:space="preserve">. No human in that loop. That is Level 4. Everything below it is an agent that fires commands into the dark.</w:t>
+        <w:t xml:space="preserve">. No </w:t>
+      </w:r>
+      <w:r>
+        <w:rPr>
+          <w:color w:val="4a4a6a"/>
+          <w:rtl w:val="0"/>
+        </w:rPr>
+        <w:t xml:space="preserve">humans</w:t>
+      </w:r>
+      <w:r>
+        <w:rPr>
+          <w:rFonts w:ascii="Georgia" w:cs="Georgia" w:eastAsia="Georgia" w:hAnsi="Georgia"/>
+          <w:color w:val="4a4a6a"/>
+          <w:sz w:val="22"/>
+          <w:szCs w:val="22"/>
+          <w:rtl w:val="0"/>
+        </w:rPr>
+        <w:t xml:space="preserve"> in that loop. That is Level 4. Everything below it is an agent that fires commands into the dark.</w:t>
       </w:r>
       <w:r>
         <w:rPr>
@@ -4362,20 +4380,13 @@
       </w:pPr>
       <w:r>
         <w:rPr>
-          <w:color w:val="4a4a6a"/>
-          <w:rtl w:val="0"/>
-        </w:rPr>
-        <w:t xml:space="preserve">A comparative analysis of production agent harnesses — including Claude Code, Pi, OpenClaw, and Letta — reveals a fifth operational requirement that R.E.S.T.</w:t>
-      </w:r>
-      <w:r>
-        <w:rPr>
-          <w:rFonts w:ascii="Georgia" w:cs="Georgia" w:eastAsia="Georgia" w:hAnsi="Georgia"/>
-          <w:color w:val="4a4a6a"/>
-          <w:sz w:val="22"/>
-          <w:szCs w:val="22"/>
-          <w:rtl w:val="0"/>
-        </w:rPr>
-        <w:t xml:space="preserve"> does not cover: context continuity. Every one of these systems independently converged on the same finding: an AIN Level 4 feedback loop that works at demo scale will degrade under production load if the agent runtime does not actively manage its own working set. As sessions grow, file reads expand, tool outputs accumulate, and sub-agent calls multiply. Without active management, the agent loses coherence — not catastrophically, but gradually, in ways that are hard to detect and expensive to diagnose.</w:t>
+          <w:rFonts w:ascii="Georgia" w:cs="Georgia" w:eastAsia="Georgia" w:hAnsi="Georgia"/>
+          <w:color w:val="4a4a6a"/>
+          <w:sz w:val="22"/>
+          <w:szCs w:val="22"/>
+          <w:rtl w:val="0"/>
+        </w:rPr>
+        <w:t xml:space="preserve">Comparative analysis of production agent harnesses — including Claude Code, Pi, OpenClaw, and Letta — reveals a fifth operational requirement that R.E.S.T does not cover: context continuity. Every one of these systems independently converged on the same finding: an AIN Level 4 feedback loop that works at demo scale will degrade under production load if the agent runtime does not actively manage its own working set. As sessions grow, file reads expand, tool outputs accumulate, and sub-agent calls multiply. Without active management, the agent loses coherence — not catastrophically, but gradually, in ways that are hard to detect and expensive to diagnose.</w:t>
       </w:r>
     </w:p>
     <w:p>
@@ -4419,24 +4430,41 @@
           <w:szCs w:val="22"/>
           <w:rtl w:val="0"/>
         </w:rPr>
-        <w:t xml:space="preserve">There is also a deduplication principle worth naming explicitly: known observations should not consume context budget </w:t>
-      </w:r>
-      <w:r>
-        <w:rPr>
-          <w:color w:val="4a4a6a"/>
-          <w:rtl w:val="0"/>
-        </w:rPr>
-        <w:t xml:space="preserve">as much as</w:t>
-      </w:r>
-      <w:r>
-        <w:rPr>
-          <w:rFonts w:ascii="Georgia" w:cs="Georgia" w:eastAsia="Georgia" w:hAnsi="Georgia"/>
-          <w:color w:val="4a4a6a"/>
-          <w:sz w:val="22"/>
-          <w:szCs w:val="22"/>
-          <w:rtl w:val="0"/>
-        </w:rPr>
-        <w:t xml:space="preserve"> new ones do. Claude Code implements this as read deduplication — if the agent re-reads the same file at the same range and the file has not changed, a stub is returned rather than the full content. AgentAlign’s rule system applies the same logic at the governance layer: drift-detector checks rules before creating ADRs, so known failure patterns do not regenerate governance overhead. The underlying principle is identical — compounding systems must not re-process what they already know.</w:t>
+        <w:t xml:space="preserve">There is also a deduplication principle worth naming explicitly: known observations should not consume context </w:t>
+      </w:r>
+      <w:r>
+        <w:rPr>
+          <w:color w:val="4a4a6a"/>
+          <w:rtl w:val="0"/>
+        </w:rPr>
+        <w:t xml:space="preserve">budgets</w:t>
+      </w:r>
+      <w:r>
+        <w:rPr>
+          <w:rFonts w:ascii="Georgia" w:cs="Georgia" w:eastAsia="Georgia" w:hAnsi="Georgia"/>
+          <w:color w:val="4a4a6a"/>
+          <w:sz w:val="22"/>
+          <w:szCs w:val="22"/>
+          <w:rtl w:val="0"/>
+        </w:rPr>
+        <w:t xml:space="preserve"> the same way new ones do. Claude Code implements this as read deduplication — if the agent re-reads the same file at the same range and the file has not changed, a stub is returned rather than the full content. </w:t>
+      </w:r>
+      <w:r>
+        <w:rPr>
+          <w:color w:val="4a4a6a"/>
+          <w:rtl w:val="0"/>
+        </w:rPr>
+        <w:t xml:space="preserve">Arpinine-Harness</w:t>
+      </w:r>
+      <w:r>
+        <w:rPr>
+          <w:rFonts w:ascii="Georgia" w:cs="Georgia" w:eastAsia="Georgia" w:hAnsi="Georgia"/>
+          <w:color w:val="4a4a6a"/>
+          <w:sz w:val="22"/>
+          <w:szCs w:val="22"/>
+          <w:rtl w:val="0"/>
+        </w:rPr>
+        <w:t xml:space="preserve">’s rule system applies the same logic at the governance layer: drift-detector checks rules before creating ADRs, so known failure patterns do not regenerate governance overhead. The underlying principle is identical — compounding systems must not re-process what they already know.</w:t>
       </w:r>
     </w:p>
     <w:p>
@@ -4480,7 +4508,24 @@
           <w:szCs w:val="22"/>
           <w:rtl w:val="0"/>
         </w:rPr>
-        <w:t xml:space="preserve">The most important architectural nuance the convergence analysis surfaces is not that tool results get offloaded — it is when. Claude Code does not wait for context pressure. Before every API call, oversized tool results are written to disk and replaced with a 2KB preview in context. A 60KB grep result gets kicked out on the very first turn, before anything is close to full. Experience teaches that tool output is the primary killer of the context window, so the harness acts first. The implication for AIN Level 4 design: tool result offloading should not be a pressure-relief valve. It should be the default path, with in-context retention as the exception. Tool output is presumptively disposable — useful for the current reasoning step, archivable thereafter.</w:t>
+        <w:t xml:space="preserve">The most important architectural nuance </w:t>
+      </w:r>
+      <w:r>
+        <w:rPr>
+          <w:color w:val="4a4a6a"/>
+          <w:rtl w:val="0"/>
+        </w:rPr>
+        <w:t xml:space="preserve">of</w:t>
+      </w:r>
+      <w:r>
+        <w:rPr>
+          <w:rFonts w:ascii="Georgia" w:cs="Georgia" w:eastAsia="Georgia" w:hAnsi="Georgia"/>
+          <w:color w:val="4a4a6a"/>
+          <w:sz w:val="22"/>
+          <w:szCs w:val="22"/>
+          <w:rtl w:val="0"/>
+        </w:rPr>
+        <w:t xml:space="preserve"> convergence analysis surfaces is not that tool results get offloaded — it is when. Claude Code does not wait for context pressure. Before every API call, oversized tool results are written to disk and replaced with a 2KB preview in context. A 60KB grep result gets kicked out on the very first turn, before anything is close to full. Experience teaches that tool output is the primary killer of the context window, so the harness acts first. The implication for AIN Level 4 design: tool result offloading should not be a pressure-relief valve. It should be the default path, with in-context retention as the exception. Tool output is presumptively disposable — useful for the current reasoning step, archivable thereafter.</w:t>
       </w:r>
     </w:p>
     <w:p>
@@ -4502,24 +4547,7 @@
           <w:szCs w:val="22"/>
           <w:rtl w:val="0"/>
         </w:rPr>
-        <w:t xml:space="preserve">Sub-agent session isolation follows the same logic. All four harnesses default to not passing parent session context to child agents — not because engineers forgot to wire up inheritance, but because parent session noise overwhelms child task objectives. Context is not inherited. Context must be designed. The deliberate absence of inheritance is itself a governance decision, as consequential as any rule in the </w:t>
-      </w:r>
-      <w:r>
-        <w:rPr>
-          <w:color w:val="4a4a6a"/>
-          <w:rtl w:val="0"/>
-        </w:rPr>
-        <w:t xml:space="preserve">ruleset</w:t>
-      </w:r>
-      <w:r>
-        <w:rPr>
-          <w:rFonts w:ascii="Georgia" w:cs="Georgia" w:eastAsia="Georgia" w:hAnsi="Georgia"/>
-          <w:color w:val="4a4a6a"/>
-          <w:sz w:val="22"/>
-          <w:szCs w:val="22"/>
-          <w:rtl w:val="0"/>
-        </w:rPr>
-        <w:t xml:space="preserve">. A child agent that receives only its task string and the current rule set will outperform one that inherits a sprawling parent transcript every time.</w:t>
+        <w:t xml:space="preserve">Sub-agent session isolation follows the same logic. All four harnesses default to not passing parent session context to child agents — not because engineers forgot to wire up inheritance, but because parent session noise overwhelms child task objectives. Context is not inherited. Context must be designed. The deliberate absence of inheritance is itself a governance decision, as consequential as any rule in the rule set. A child agent that receives only its task string and the current rule set will outperform one that inherits a sprawling parent transcript every time.</w:t>
       </w:r>
     </w:p>
     <w:p>
@@ -4545,30 +4573,7 @@
           <w:szCs w:val="21"/>
           <w:rtl w:val="0"/>
         </w:rPr>
-        <w:t xml:space="preserve">Context continuity is not a feature to add later. A product that achieves AIN Level 4 composability and feedback in short sessions but degrades after 30 minutes of production operation has not achieved AIN Level 4. It has achieved a demo. Fifty years of computing taught us that the best memory management is the kind </w:t>
-      </w:r>
-      <w:r>
-        <w:rPr>
-          <w:i w:val="1"/>
-          <w:iCs w:val="1"/>
-          <w:color w:val="1a7a7a"/>
-          <w:sz w:val="21"/>
-          <w:szCs w:val="21"/>
-          <w:rtl w:val="0"/>
-        </w:rPr>
-        <w:t xml:space="preserve">that </w:t>
-      </w:r>
-      <w:r>
-        <w:rPr>
-          <w:rFonts w:ascii="Georgia" w:cs="Georgia" w:eastAsia="Georgia" w:hAnsi="Georgia"/>
-          <w:i w:val="1"/>
-          <w:iCs w:val="1"/>
-          <w:color w:val="1a7a7a"/>
-          <w:sz w:val="21"/>
-          <w:szCs w:val="21"/>
-          <w:rtl w:val="0"/>
-        </w:rPr>
-        <w:t xml:space="preserve">the running program never has to think about. The same principle applies here: the goal is not to show the agent everything — it is to give it the right working set at the right time, managed by the harness, invisible to the agent’s reasoning layer.</w:t>
+        <w:t xml:space="preserve">Context continuity is not a feature to add later. A product that achieves AIN Level 4 composability and feedback in short sessions but degrades after 30 minutes of production operation has not achieved AIN Level 4. It has achieved a demo. Fifty years of computing taught us that the best memory management is the kind the running program never has to think about. The same principle applies here: the goal is not to show the agent everything — it is to give it the right working set at the right time, managed by the harness, invisible to the agent’s reasoning layer.</w:t>
       </w:r>
     </w:p>
     <w:p>
@@ -4642,7 +4647,7 @@
                 <w:szCs w:val="19"/>
                 <w:rtl w:val="0"/>
               </w:rPr>
-              <w:t xml:space="preserve">▸ AgentAlign implementation  </w:t>
+              <w:t xml:space="preserve">▸ Arpinine-Harness implementation  </w:t>
             </w:r>
             <w:r>
               <w:rPr>
@@ -4772,7 +4777,26 @@
                 <w:szCs w:val="20"/>
                 <w:rtl w:val="0"/>
               </w:rPr>
-              <w:t xml:space="preserve">A team building an AIN Level 4 product while operating at EP Level 2 is the most dangerous configuration in the framework. AgentAlign’s /spec-status governance table makes this mismatch visible by surfacing EP-level indicators (rule density, ADR coverage, drift attribution counts) alongside AIN-level indicators (eval plan status, feedback channel definition) in a single view.</w:t>
+              <w:t xml:space="preserve">A team building an AIN Level 4 product while operating at EP Level 2 is the most dangerous configuration in the framework. </w:t>
+            </w:r>
+            <w:r>
+              <w:rPr>
+                <w:color w:val="4a4a6a"/>
+                <w:sz w:val="20"/>
+                <w:szCs w:val="20"/>
+                <w:rtl w:val="0"/>
+              </w:rPr>
+              <w:t xml:space="preserve">Arpinine-Harness</w:t>
+            </w:r>
+            <w:r>
+              <w:rPr>
+                <w:rFonts w:ascii="Georgia" w:cs="Georgia" w:eastAsia="Georgia" w:hAnsi="Georgia"/>
+                <w:color w:val="4a4a6a"/>
+                <w:sz w:val="20"/>
+                <w:szCs w:val="20"/>
+                <w:rtl w:val="0"/>
+              </w:rPr>
+              <w:t xml:space="preserve">’s /spec-status governance table makes this mismatch visible by surfacing EP-level indicators (rule density, ADR coverage, drift attribution counts) alongside AIN-level indicators (eval plan status, feedback channel definition) in a single view.</w:t>
             </w:r>
             <w:r>
               <w:rPr>
@@ -5539,7 +5563,41 @@
           <w:szCs w:val="22"/>
           <w:rtl w:val="0"/>
         </w:rPr>
-        <w:t xml:space="preserve">In AgentAlign, these four metrics surface directly in /spec-status — the governance table that combines EP-level indicators (rule density, attribution counts, ADR coverage) with AIN-level indicators (eval plan status, feedback channel definition) in a single view. For teams not using AgentAlign, the same metrics can be tracked manually in a shared retro log alongside each project’s audit findings.</w:t>
+        <w:t xml:space="preserve">In </w:t>
+      </w:r>
+      <w:r>
+        <w:rPr>
+          <w:color w:val="4a4a6a"/>
+          <w:rtl w:val="0"/>
+        </w:rPr>
+        <w:t xml:space="preserve">Arpinine-Harness</w:t>
+      </w:r>
+      <w:r>
+        <w:rPr>
+          <w:rFonts w:ascii="Georgia" w:cs="Georgia" w:eastAsia="Georgia" w:hAnsi="Georgia"/>
+          <w:color w:val="4a4a6a"/>
+          <w:sz w:val="22"/>
+          <w:szCs w:val="22"/>
+          <w:rtl w:val="0"/>
+        </w:rPr>
+        <w:t xml:space="preserve">, these four metrics surface directly in /spec-status — the governance table that combines EP-level indicators (rule density, attribution counts, ADR coverage) with AIN-level indicators (eval plan status, feedback channel definition) in a single view. For teams not using </w:t>
+      </w:r>
+      <w:r>
+        <w:rPr>
+          <w:color w:val="4a4a6a"/>
+          <w:rtl w:val="0"/>
+        </w:rPr>
+        <w:t xml:space="preserve">Arpinine-Harness</w:t>
+      </w:r>
+      <w:r>
+        <w:rPr>
+          <w:rFonts w:ascii="Georgia" w:cs="Georgia" w:eastAsia="Georgia" w:hAnsi="Georgia"/>
+          <w:color w:val="4a4a6a"/>
+          <w:sz w:val="22"/>
+          <w:szCs w:val="22"/>
+          <w:rtl w:val="0"/>
+        </w:rPr>
+        <w:t xml:space="preserve">, the same metrics can be tracked manually in a shared retro log alongside each project’s audit findings.</w:t>
       </w:r>
       <w:r>
         <w:rPr>
@@ -10014,7 +10072,24 @@
           <w:szCs w:val="22"/>
           <w:rtl w:val="0"/>
         </w:rPr>
-        <w:t xml:space="preserve">. It is about whether corrections are becoming rules. Open your rule files. If they are empty or sparse, you are at 3 regardless of how good your sessions feel. In AgentAlign terms: if /spec-retro has never been run, or .specify/rules/ is empty, nothing is compounding.</w:t>
+        <w:t xml:space="preserve">. It is about whether corrections are becoming rules. Open your rule files. If they are empty or sparse, you are at 3 regardless of how good your sessions feel. In </w:t>
+      </w:r>
+      <w:r>
+        <w:rPr>
+          <w:color w:val="4a4a6a"/>
+          <w:rtl w:val="0"/>
+        </w:rPr>
+        <w:t xml:space="preserve">Arpinine-Harness</w:t>
+      </w:r>
+      <w:r>
+        <w:rPr>
+          <w:rFonts w:ascii="Georgia" w:cs="Georgia" w:eastAsia="Georgia" w:hAnsi="Georgia"/>
+          <w:color w:val="4a4a6a"/>
+          <w:sz w:val="22"/>
+          <w:szCs w:val="22"/>
+          <w:rtl w:val="0"/>
+        </w:rPr>
+        <w:t xml:space="preserve"> terms: if /spec-retro has never been run, or .specify/rules/ is empty, nothing is compounding.</w:t>
       </w:r>
       <w:r>
         <w:rPr>
@@ -10048,7 +10123,25 @@
           <w:szCs w:val="22"/>
           <w:rtl w:val="0"/>
         </w:rPr>
-        <w:t xml:space="preserve">You cannot feature-add your way to Level 3. It requires a deliberate design decision about what vocabulary of operations an AI agent should be able to compose within your system — and that question has to be answered before implementation, not discovered during it. AgentAlign enforces this through the agent_callable_operations section of the AIN assessment block, which must be fully populated before implementation unlocks for AIN ≥ 3 specs.</w:t>
+        <w:t xml:space="preserve">You cannot feature-add your way to Level 3. It requires a deliberate design decision about what vocabulary of operations an AI agent should be able to compose within your system — and that question has to be answered before implementation, not discovered during it. </w:t>
+      </w:r>
+      <w:r>
+        <w:rPr>
+          <w:rFonts w:ascii="Gungsuh" w:cs="Gungsuh" w:eastAsia="Gungsuh" w:hAnsi="Gungsuh"/>
+          <w:color w:val="4a4a6a"/>
+          <w:rtl w:val="0"/>
+        </w:rPr>
+        <w:t xml:space="preserve">Arpinine-Harness</w:t>
+      </w:r>
+      <w:r>
+        <w:rPr>
+          <w:rFonts w:ascii="Gungsuh" w:cs="Gungsuh" w:eastAsia="Gungsuh" w:hAnsi="Gungsuh"/>
+          <w:color w:val="4a4a6a"/>
+          <w:sz w:val="22"/>
+          <w:szCs w:val="22"/>
+          <w:rtl w:val="0"/>
+        </w:rPr>
+        <w:t xml:space="preserve"> enforces this through the agent_callable_operations section of the AIN assessment block, which must be fully populated before implementation unlocks for AIN ≥ 3 specs.</w:t>
       </w:r>
       <w:r>
         <w:rPr>
@@ -10246,7 +10339,24 @@
           <w:szCs w:val="22"/>
           <w:rtl w:val="0"/>
         </w:rPr>
-        <w:t xml:space="preserve">A concrete example of what shared vocabulary looks like in practice: an AgentAlign rule file has a structured YAML header with rule-id, category, triggers, severity, and source-adr. An AIN Level 4 product that exposes its own policy layer can expose that same schema as an agent-callable operation — an agent operating inside the platform can query the active rule set, check whether a proposed action would trigger a rule violation, and adjust its workflow before executing. The rule format designed to govern human-AI collaboration during construction becomes a live policy interface for agents operating in production. Same schema, same vocabulary, two uses. That is what convergence means in practice, not as a concept.</w:t>
+        <w:t xml:space="preserve">A concrete example of what shared vocabulary looks like in practice: an </w:t>
+      </w:r>
+      <w:r>
+        <w:rPr>
+          <w:color w:val="4a4a6a"/>
+          <w:rtl w:val="0"/>
+        </w:rPr>
+        <w:t xml:space="preserve">Arpinine-Harness</w:t>
+      </w:r>
+      <w:r>
+        <w:rPr>
+          <w:rFonts w:ascii="Georgia" w:cs="Georgia" w:eastAsia="Georgia" w:hAnsi="Georgia"/>
+          <w:color w:val="4a4a6a"/>
+          <w:sz w:val="22"/>
+          <w:szCs w:val="22"/>
+          <w:rtl w:val="0"/>
+        </w:rPr>
+        <w:t xml:space="preserve"> rule file has a structured YAML header with rule-id, category, triggers, severity, and source-adr. An AIN Level 4 product that exposes its own policy layer can expose that same schema as an agent-callable operation — an agent operating inside the platform can query the active rule set, check whether a proposed action would trigger a rule violation, and adjust its workflow before executing. The rule format designed to govern human-AI collaboration during construction becomes a live policy interface for agents operating in production. Same schema, same vocabulary, two uses. That is what convergence means in practice, not as a concept.</w:t>
       </w:r>
       <w:r>
         <w:rPr>
@@ -10364,7 +10474,7 @@
                 <w:szCs w:val="19"/>
                 <w:rtl w:val="0"/>
               </w:rPr>
-              <w:t xml:space="preserve">▸ AgentAlign implementation  </w:t>
+              <w:t xml:space="preserve">▸ Arpinine-Harness implementation  </w:t>
             </w:r>
             <w:r>
               <w:rPr>
@@ -10403,13 +10513,22 @@
             </w:r>
             <w:r>
               <w:rPr>
+                <w:color w:val="4a4a6a"/>
+                <w:sz w:val="20"/>
+                <w:szCs w:val="20"/>
+                <w:rtl w:val="0"/>
+              </w:rPr>
+              <w:t xml:space="preserve">Arpinine-Harness</w:t>
+            </w:r>
+            <w:r>
+              <w:rPr>
                 <w:rFonts w:ascii="Georgia" w:cs="Georgia" w:eastAsia="Georgia" w:hAnsi="Georgia"/>
                 <w:color w:val="4a4a6a"/>
                 <w:sz w:val="20"/>
                 <w:szCs w:val="20"/>
                 <w:rtl w:val="0"/>
               </w:rPr>
-              <w:t xml:space="preserve">AgentAlign’s rule format (.specify/rules/&lt;category&gt;/&lt;rule-id&gt;.md with structured YAML frontmatter) and ADR schema (machine-readable governs: and covers: linkage) are designed to be legible not just to the human practitioners who maintain them, but to AI agents that may eventually operate within the governed system. A platform that exposes its own governance </w:t>
+              <w:t xml:space="preserve">’s rule format (.specify/rules/&lt;category&gt;/&lt;rule-id&gt;.md with structured YAML frontmatter) and ADR schema (machine-readable governs: and covers: linkage) are designed to be legible not just to the human practitioners who maintain them, but to AI agents that may eventually operate within the governed system. A platform that exposes its own governance </w:t>
             </w:r>
             <w:r>
               <w:rPr>
@@ -11890,7 +12009,24 @@
           <w:szCs w:val="22"/>
           <w:rtl w:val="0"/>
         </w:rPr>
-        <w:t xml:space="preserve">In AgentAlign, the EP metrics above surface in /spec-status alongside AIN indicators — giving a single view of both axes trending together or diverging. For teams tracking manually, a shared retro log with these four data points per project is sufficient to see the compounding curve within two or three projects.</w:t>
+        <w:t xml:space="preserve">In </w:t>
+      </w:r>
+      <w:r>
+        <w:rPr>
+          <w:color w:val="4a4a6a"/>
+          <w:rtl w:val="0"/>
+        </w:rPr>
+        <w:t xml:space="preserve">Arpinine-Harness</w:t>
+      </w:r>
+      <w:r>
+        <w:rPr>
+          <w:rFonts w:ascii="Georgia" w:cs="Georgia" w:eastAsia="Georgia" w:hAnsi="Georgia"/>
+          <w:color w:val="4a4a6a"/>
+          <w:sz w:val="22"/>
+          <w:szCs w:val="22"/>
+          <w:rtl w:val="0"/>
+        </w:rPr>
+        <w:t xml:space="preserve">, the EP metrics above surface in /spec-status alongside AIN indicators — giving a single view of both axes trending together or diverging. For teams tracking manually, a shared retro log with these four data points per project is sufficient to see the compounding curve within two or three projects.</w:t>
       </w:r>
       <w:r>
         <w:rPr>
@@ -12495,6 +12631,13 @@
       </w:pPr>
       <w:r>
         <w:rPr>
+          <w:color w:val="4a4a6a"/>
+          <w:rtl w:val="0"/>
+        </w:rPr>
+        <w:t xml:space="preserve">Arpinine-Harness</w:t>
+      </w:r>
+      <w:r>
+        <w:rPr>
           <w:rFonts w:ascii="Georgia" w:cs="Georgia" w:eastAsia="Georgia" w:hAnsi="Georgia"/>
           <w:b w:val="0"/>
           <w:bCs w:val="0"/>
@@ -12510,7 +12653,7 @@
           <w:vertAlign w:val="baseline"/>
           <w:rtl w:val="0"/>
         </w:rPr>
-        <w:t xml:space="preserve">AgentAlign has a known open problem: the natural-language trigger conditions in its rule files are evaluated against content by </w:t>
+        <w:t xml:space="preserve"> has a known open problem: the natural-language trigger conditions in its rule files are evaluated against content by </w:t>
       </w:r>
       <w:r>
         <w:rPr>
@@ -12913,13 +13056,20 @@
       </w:pPr>
       <w:r>
         <w:rPr>
-          <w:rFonts w:ascii="Georgia" w:cs="Georgia" w:eastAsia="Georgia" w:hAnsi="Georgia"/>
-          <w:color w:val="4a4a6a"/>
-          <w:sz w:val="22"/>
-          <w:szCs w:val="22"/>
-          <w:rtl w:val="0"/>
-        </w:rPr>
-        <w:t xml:space="preserve">AgentAlign, built by Arpinine, is the most complete working implementation of these ideas we have seen. It is not the only possible implementation — but it demonstrates that the governance structures described here are not theoretical. They run in production, </w:t>
+          <w:color w:val="4a4a6a"/>
+          <w:rtl w:val="0"/>
+        </w:rPr>
+        <w:t xml:space="preserve">Arpinine-Harness</w:t>
+      </w:r>
+      <w:r>
+        <w:rPr>
+          <w:rFonts w:ascii="Georgia" w:cs="Georgia" w:eastAsia="Georgia" w:hAnsi="Georgia"/>
+          <w:color w:val="4a4a6a"/>
+          <w:sz w:val="22"/>
+          <w:szCs w:val="22"/>
+          <w:rtl w:val="0"/>
+        </w:rPr>
+        <w:t xml:space="preserve">, built by Arpinine, is the most complete working implementation of these ideas we have seen. It is not the only possible implementation — but it demonstrates that the governance structures described here are not theoretical. They run in production, </w:t>
       </w:r>
       <w:r>
         <w:rPr>
@@ -13022,7 +13172,6 @@
       </w:pPr>
       <w:r>
         <w:rPr>
-          <w:rFonts w:ascii="Georgia" w:cs="Georgia" w:eastAsia="Georgia" w:hAnsi="Georgia"/>
           <w:i w:val="1"/>
           <w:iCs w:val="1"/>
           <w:color w:val="1a7a7a"/>
@@ -13030,7 +13179,19 @@
           <w:szCs w:val="21"/>
           <w:rtl w:val="0"/>
         </w:rPr>
-        <w:t xml:space="preserve">Try the self-assessment. Run one retro with rule extraction. Pick your highest-pain workflow and govern it under EP 4 conditions for six weeks. Then share your EP and AIN coordinates — and whether the transition mechanics described here matched what you actually experienced.</w:t>
+        <w:t xml:space="preserve">Try self-assessment</w:t>
+      </w:r>
+      <w:r>
+        <w:rPr>
+          <w:rFonts w:ascii="Georgia" w:cs="Georgia" w:eastAsia="Georgia" w:hAnsi="Georgia"/>
+          <w:i w:val="1"/>
+          <w:iCs w:val="1"/>
+          <w:color w:val="1a7a7a"/>
+          <w:sz w:val="21"/>
+          <w:szCs w:val="21"/>
+          <w:rtl w:val="0"/>
+        </w:rPr>
+        <w:t xml:space="preserve">. Run one retro with rule extraction. Pick your highest-pain workflow and govern it under EP 4 conditions for six weeks. Then share your EP and AIN coordinates — and whether the transition mechanics described here matched what you actually experienced.</w:t>
       </w:r>
       <w:r>
         <w:rPr>
@@ -13517,7 +13678,28 @@
           <w:szCs w:val="22"/>
           <w:rtl w:val="0"/>
         </w:rPr>
-        <w:t xml:space="preserve"> patterns at varying levels of maturity. AgentAlign is one concrete </w:t>
+        <w:t xml:space="preserve"> patterns at varying levels of maturity. </w:t>
+      </w:r>
+      <w:r>
+        <w:rPr>
+          <w:i w:val="1"/>
+          <w:iCs w:val="1"/>
+          <w:color w:val="4a4a6a"/>
+          <w:rtl w:val="0"/>
+        </w:rPr>
+        <w:t xml:space="preserve">Arpinine-Harness</w:t>
+      </w:r>
+      <w:r>
+        <w:rPr>
+          <w:rFonts w:ascii="Georgia" w:cs="Georgia" w:eastAsia="Georgia" w:hAnsi="Georgia"/>
+          <w:i w:val="1"/>
+          <w:iCs w:val="1"/>
+          <w:color w:val="4a4a6a"/>
+          <w:sz w:val="22"/>
+          <w:szCs w:val="22"/>
+          <w:rtl w:val="0"/>
+        </w:rPr>
+        <w:t xml:space="preserve"> is one concrete </w:t>
       </w:r>
       <w:r>
         <w:rPr>
@@ -13572,7 +13754,7 @@
           <w:szCs w:val="19"/>
           <w:rtl w:val="0"/>
         </w:rPr>
-        <w:t xml:space="preserve">AgentAlign is available at:  </w:t>
+        <w:t xml:space="preserve">Arpinine-Harness is available at:  </w:t>
       </w:r>
       <w:r>
         <w:rPr>
@@ -13584,7 +13766,7 @@
           <w:szCs w:val="19"/>
           <w:rtl w:val="0"/>
         </w:rPr>
-        <w:t xml:space="preserve">https://arpinine.com/agent-align</w:t>
+        <w:t xml:space="preserve">https://arpinine.com/arpinine-harness</w:t>
       </w:r>
       <w:r>
         <w:rPr>
@@ -13639,7 +13821,7 @@
       </w:r>
     </w:p>
     <w:sectPr>
-      <w:footerReference r:id="rId7" w:type="default"/>
+      <w:footerReference r:id="rId8" w:type="default"/>
       <w:pgSz w:h="15840" w:w="12240" w:orient="portrait"/>
       <w:pgMar w:bottom="1260" w:top="1260" w:left="1440" w:right="1440" w:header="708" w:footer="708"/>
       <w:pgNumType w:start="1"/>
@@ -14536,4 +14718,19 @@
   </a:objectDefaults>
   <a:extraClrSchemeLst/>
 </a:theme>
+</file>
+
+<file path=customXML/item1.xml><?xml version="1.0" encoding="utf-8"?>
+<go:gDocsCustomXmlDataStorage xmlns:go="http://customooxmlschemas.google.com/" xmlns:r="http://schemas.openxmlformats.org/officeDocument/2006/relationships" uri="GoogleDocsCustomDataVersion2">
+  <go:docsCustomData xmlns:go="http://customooxmlschemas.google.com/" roundtripDataSignature="AMtx7mhZpnmrqkGLr1Y9hvsnJ1Xh9WDVXg==">CgMxLjA4AHIhMVJMTkVTWmpXUnRZR2xyOUc1NDlhUHBveldpcXRPRDRM</go:docsCustomData>
+</go:gDocsCustomXmlDataStorage>
+</file>
+
+<file path=customXML/itemProps1.xml><?xml version="1.0" encoding="utf-8"?>
+<ds:datastoreItem xmlns:ds="http://schemas.openxmlformats.org/officeDocument/2006/customXml" ds:itemID="{11111111-1234-1234-1234-123412341234}">
+  <ds:schemaRefs>
+    <ds:schemaRef ds:uri="http://schemas.openxmlformats.org/officeDocument/2006/relationships"/>
+    <ds:schemaRef ds:uri="http://customooxmlschemas.google.com/"/>
+  </ds:schemaRefs>
+</ds:datastoreItem>
 </file>
</xml_diff>